<commit_message>
update: bgp-crc-fc.docx pandoc 完成(补图,commit)
</commit_message>
<xml_diff>
--- a/bgp-crc-fc.docx
+++ b/bgp-crc-fc.docx
@@ -1478,6 +1478,114 @@
     <w:bookmarkEnd w:id="13"/>
     <w:bookmarkEnd w:id="14"/>
     <w:bookmarkEnd w:id="15"/>
+    <w:p>
+      <w:r>
+        <w:drawing>
+          <wp:inline>
+            <wp:extent cx="5029200" cy="3143250"/>
+            <wp:docPr id="1" name="Picture 1"/>
+            <wp:cNvGraphicFramePr>
+              <a:graphicFrameLocks noChangeAspect="1"/>
+            </wp:cNvGraphicFramePr>
+            <a:graphic>
+              <a:graphicData uri="http://schemas.openxmlformats.org/drawingml/2006/picture">
+                <pic:pic>
+                  <pic:nvPicPr>
+                    <pic:cNvPr id="0" name="image.png"/>
+                    <pic:cNvPicPr/>
+                  </pic:nvPicPr>
+                  <pic:blipFill>
+                    <a:blip r:embed="rId9"/>
+                    <a:stretch>
+                      <a:fillRect/>
+                    </a:stretch>
+                  </pic:blipFill>
+                  <pic:spPr>
+                    <a:xfrm>
+                      <a:off x="0" y="0"/>
+                      <a:ext cx="5029200" cy="3143250"/>
+                    </a:xfrm>
+                    <a:prstGeom prst="rect"/>
+                  </pic:spPr>
+                </pic:pic>
+              </a:graphicData>
+            </a:graphic>
+          </wp:inline>
+        </w:drawing>
+      </w:r>
+    </w:p>
+    <w:p>
+      <w:r>
+        <w:drawing>
+          <wp:inline>
+            <wp:extent cx="5029200" cy="3143250"/>
+            <wp:docPr id="2" name="Picture 2"/>
+            <wp:cNvGraphicFramePr>
+              <a:graphicFrameLocks noChangeAspect="1"/>
+            </wp:cNvGraphicFramePr>
+            <a:graphic>
+              <a:graphicData uri="http://schemas.openxmlformats.org/drawingml/2006/picture">
+                <pic:pic>
+                  <pic:nvPicPr>
+                    <pic:cNvPr id="0" name="image.png"/>
+                    <pic:cNvPicPr/>
+                  </pic:nvPicPr>
+                  <pic:blipFill>
+                    <a:blip r:embed="rId10"/>
+                    <a:stretch>
+                      <a:fillRect/>
+                    </a:stretch>
+                  </pic:blipFill>
+                  <pic:spPr>
+                    <a:xfrm>
+                      <a:off x="0" y="0"/>
+                      <a:ext cx="5029200" cy="3143250"/>
+                    </a:xfrm>
+                    <a:prstGeom prst="rect"/>
+                  </pic:spPr>
+                </pic:pic>
+              </a:graphicData>
+            </a:graphic>
+          </wp:inline>
+        </w:drawing>
+      </w:r>
+    </w:p>
+    <w:p>
+      <w:r>
+        <w:drawing>
+          <wp:inline>
+            <wp:extent cx="5029200" cy="3143250"/>
+            <wp:docPr id="3" name="Picture 3"/>
+            <wp:cNvGraphicFramePr>
+              <a:graphicFrameLocks noChangeAspect="1"/>
+            </wp:cNvGraphicFramePr>
+            <a:graphic>
+              <a:graphicData uri="http://schemas.openxmlformats.org/drawingml/2006/picture">
+                <pic:pic>
+                  <pic:nvPicPr>
+                    <pic:cNvPr id="0" name="image.png"/>
+                    <pic:cNvPicPr/>
+                  </pic:nvPicPr>
+                  <pic:blipFill>
+                    <a:blip r:embed="rId11"/>
+                    <a:stretch>
+                      <a:fillRect/>
+                    </a:stretch>
+                  </pic:blipFill>
+                  <pic:spPr>
+                    <a:xfrm>
+                      <a:off x="0" y="0"/>
+                      <a:ext cx="5029200" cy="3143250"/>
+                    </a:xfrm>
+                    <a:prstGeom prst="rect"/>
+                  </pic:spPr>
+                </pic:pic>
+              </a:graphicData>
+            </a:graphic>
+          </wp:inline>
+        </w:drawing>
+      </w:r>
+    </w:p>
     <w:sectPr>
       <w:footnotePr>
         <w:numRestart w:val="eachSect"/>

</xml_diff>